<commit_message>
Se adiciona archivo con las evidencias
</commit_message>
<xml_diff>
--- a/taller_git.docx
+++ b/taller_git.docx
@@ -268,6 +268,124 @@
         </w:drawing>
       </w:r>
     </w:p>
+    <w:p>
+      <w:r>
+        <w:t xml:space="preserve">Se adiciona el contenido y se hace el </w:t>
+      </w:r>
+      <w:proofErr w:type="spellStart"/>
+      <w:r>
+        <w:t>commit</w:t>
+      </w:r>
+      <w:proofErr w:type="spellEnd"/>
+      <w:r>
+        <w:t xml:space="preserve"> con el comentario del cambio</w:t>
+      </w:r>
+    </w:p>
+    <w:p>
+      <w:r>
+        <w:rPr>
+          <w:noProof/>
+        </w:rPr>
+        <w:drawing>
+          <wp:inline distT="0" distB="0" distL="0" distR="0" wp14:anchorId="62D9593E" wp14:editId="3849D45D">
+            <wp:extent cx="5612130" cy="3160395"/>
+            <wp:effectExtent l="0" t="0" r="7620" b="1905"/>
+            <wp:docPr id="687419321" name="Imagen 1"/>
+            <wp:cNvGraphicFramePr>
+              <a:graphicFrameLocks xmlns:a="http://schemas.openxmlformats.org/drawingml/2006/main" noChangeAspect="1"/>
+            </wp:cNvGraphicFramePr>
+            <a:graphic xmlns:a="http://schemas.openxmlformats.org/drawingml/2006/main">
+              <a:graphicData uri="http://schemas.openxmlformats.org/drawingml/2006/picture">
+                <pic:pic xmlns:pic="http://schemas.openxmlformats.org/drawingml/2006/picture">
+                  <pic:nvPicPr>
+                    <pic:cNvPr id="687419321" name=""/>
+                    <pic:cNvPicPr/>
+                  </pic:nvPicPr>
+                  <pic:blipFill>
+                    <a:blip r:embed="rId9"/>
+                    <a:stretch>
+                      <a:fillRect/>
+                    </a:stretch>
+                  </pic:blipFill>
+                  <pic:spPr>
+                    <a:xfrm>
+                      <a:off x="0" y="0"/>
+                      <a:ext cx="5612130" cy="3160395"/>
+                    </a:xfrm>
+                    <a:prstGeom prst="rect">
+                      <a:avLst/>
+                    </a:prstGeom>
+                  </pic:spPr>
+                </pic:pic>
+              </a:graphicData>
+            </a:graphic>
+          </wp:inline>
+        </w:drawing>
+      </w:r>
+    </w:p>
+    <w:p/>
+    <w:p/>
+    <w:p/>
+    <w:p/>
+    <w:p>
+      <w:r>
+        <w:lastRenderedPageBreak/>
+        <w:t>Se bajan cambios para evitar conflictos</w:t>
+      </w:r>
+    </w:p>
+    <w:p>
+      <w:r>
+        <w:rPr>
+          <w:noProof/>
+        </w:rPr>
+        <w:drawing>
+          <wp:inline distT="0" distB="0" distL="0" distR="0" wp14:anchorId="0ED403DD" wp14:editId="2EF1DA86">
+            <wp:extent cx="5612130" cy="3156585"/>
+            <wp:effectExtent l="0" t="0" r="7620" b="5715"/>
+            <wp:docPr id="639972813" name="Imagen 1"/>
+            <wp:cNvGraphicFramePr>
+              <a:graphicFrameLocks xmlns:a="http://schemas.openxmlformats.org/drawingml/2006/main" noChangeAspect="1"/>
+            </wp:cNvGraphicFramePr>
+            <a:graphic xmlns:a="http://schemas.openxmlformats.org/drawingml/2006/main">
+              <a:graphicData uri="http://schemas.openxmlformats.org/drawingml/2006/picture">
+                <pic:pic xmlns:pic="http://schemas.openxmlformats.org/drawingml/2006/picture">
+                  <pic:nvPicPr>
+                    <pic:cNvPr id="639972813" name=""/>
+                    <pic:cNvPicPr/>
+                  </pic:nvPicPr>
+                  <pic:blipFill>
+                    <a:blip r:embed="rId10"/>
+                    <a:stretch>
+                      <a:fillRect/>
+                    </a:stretch>
+                  </pic:blipFill>
+                  <pic:spPr>
+                    <a:xfrm>
+                      <a:off x="0" y="0"/>
+                      <a:ext cx="5612130" cy="3156585"/>
+                    </a:xfrm>
+                    <a:prstGeom prst="rect">
+                      <a:avLst/>
+                    </a:prstGeom>
+                  </pic:spPr>
+                </pic:pic>
+              </a:graphicData>
+            </a:graphic>
+          </wp:inline>
+        </w:drawing>
+      </w:r>
+    </w:p>
+    <w:p>
+      <w:r>
+        <w:t xml:space="preserve">Se confirman los cambios con </w:t>
+      </w:r>
+      <w:proofErr w:type="spellStart"/>
+      <w:r>
+        <w:t>push</w:t>
+      </w:r>
+      <w:proofErr w:type="spellEnd"/>
+    </w:p>
+    <w:p/>
     <w:p/>
     <w:p/>
     <w:sectPr>

</xml_diff>